<commit_message>
Reflect TelomX address and signer (Chairman Lee Jae-ho) in KO/EN/ZH MOU
</commit_message>
<xml_diff>
--- a/MOU_TelomX_Supply_EN.docx
+++ b/MOU_TelomX_Supply_EN.docx
@@ -103,9 +103,9 @@
               </w:rPr>
               <w:t>TelomX Inc. (Telom-X-Gene)</w:t>
               <w:br/>
-              <w:t>Address: [Head Office Address]</w:t>
+              <w:t>Address: 431-16, Sannae-ro, Dong-gu, Daejeon, Republic of Korea</w:t>
               <w:br/>
-              <w:t>Representative: [Name]</w:t>
+              <w:t>Representative: Lee Jae-ho (Chairman)</w:t>
             </w:r>
           </w:p>
         </w:tc>
@@ -669,7 +669,7 @@
               <w:rPr>
                 <w:rFonts w:ascii="Calibri" w:hAnsi="Calibri" w:eastAsia="Calibri"/>
               </w:rPr>
-              <w:t>Representative: ________________ (Seal)</w:t>
+              <w:t>Representative: Lee Jae-ho (Seal)</w:t>
             </w:r>
           </w:p>
         </w:tc>
@@ -697,7 +697,7 @@
               <w:rPr>
                 <w:rFonts w:ascii="Calibri" w:hAnsi="Calibri" w:eastAsia="Calibri"/>
               </w:rPr>
-              <w:t>Title:</w:t>
+              <w:t>Title: Chairman</w:t>
             </w:r>
           </w:p>
         </w:tc>

</xml_diff>

<commit_message>
Add execution date to preamble, change Art.9(2) to ICJ, remove disclaimer line
</commit_message>
<xml_diff>
--- a/MOU_TelomX_Supply_EN.docx
+++ b/MOU_TelomX_Supply_EN.docx
@@ -36,7 +36,7 @@
           <w:rFonts w:ascii="Calibri" w:hAnsi="Calibri" w:eastAsia="Calibri"/>
           <w:b w:val="0"/>
         </w:rPr>
-        <w:t>This Memorandum of Understanding (the "MOU") is entered into between the Parties identified below for the purpose of setting out the fundamental terms concerning the supply of, and cooperation in respect of, Telom-X-Gene (the "Product").</w:t>
+        <w:t>This Memorandum of Understanding (the "MOU") is entered into on [ ] / [ ] / 20[ ] between the Parties identified below for the purpose of setting out the fundamental terms concerning the supply of, and cooperation in respect of, Telom-X-Gene (the "Product").</w:t>
       </w:r>
     </w:p>
     <w:tbl>
@@ -530,7 +530,7 @@
           <w:rFonts w:ascii="Calibri" w:hAnsi="Calibri" w:eastAsia="Calibri"/>
           <w:b w:val="0"/>
         </w:rPr>
-        <w:t>2. Any dispute arising in connection with this MOU shall first be resolved through mutual consultation; failing which, it shall be finally settled by arbitration under the rules of [SIAC / KCAB / CIETAC].</w:t>
+        <w:t>2. Any dispute arising in connection with this MOU shall first be resolved through mutual consultation; failing which, it shall be finally settled under the arbitration rules of the International Court of Justice.</w:t>
       </w:r>
     </w:p>
     <w:p>
@@ -744,17 +744,6 @@
         </w:tc>
       </w:tr>
     </w:tbl>
-    <w:p/>
-    <w:p>
-      <w:r>
-        <w:rPr>
-          <w:rFonts w:ascii="Calibri" w:hAnsi="Calibri" w:eastAsia="Calibri"/>
-          <w:b w:val="0"/>
-          <w:i/>
-        </w:rPr>
-        <w:t>* This draft is a general template example. Please obtain a review by legal professionals in both jurisdictions before execution.</w:t>
-      </w:r>
-    </w:p>
     <w:sectPr>
       <w:pgSz w:w="12240" w:h="15840"/>
       <w:pgMar w:top="1440" w:right="1800" w:bottom="1440" w:left="1800" w:header="720" w:footer="720" w:gutter="0"/>

</xml_diff>